<commit_message>
add all given courcers
</commit_message>
<xml_diff>
--- a/frontend/public/docx/courses/generative-ai/Multi-modal-rag/AGENTS.docx
+++ b/frontend/public/docx/courses/generative-ai/Multi-modal-rag/AGENTS.docx
@@ -9,60 +9,31 @@
         <w:keepLines w:val="0"/>
         <w:spacing w:before="480"/>
         <w:rPr>
-          <w:b/>
-          <w:bCs/>
+          <w:b w:val="1"/>
+          <w:bCs w:val="1"/>
           <w:sz w:val="46"/>
           <w:szCs w:val="46"/>
         </w:rPr>
       </w:pPr>
-      <w:bookmarkStart w:name="_5z7zandn1p4a" w:colFirst="0" w:colLast="0" w:id="0"/>
-      <w:bookmarkEnd w:id="0"/>
-      <w:r>
-        <w:rPr>
-          <w:b/>
-          <w:bCs/>
+      <w:r>
+        <w:rPr>
+          <w:b w:val="1"/>
+          <w:bCs w:val="1"/>
           <w:sz w:val="46"/>
           <w:szCs w:val="46"/>
         </w:rPr>
         <w:t>What is a Normal AI Chatbot</w:t>
       </w:r>
-      <w:bookmarkStart w:name="_g221tthpj4qz" w:colFirst="0" w:colLast="0" w:id="1"/>
+      <w:bookmarkStart w:name="_g221tthpj4qz" w:id="1"/>
       <w:bookmarkEnd w:id="1"/>
       <w:r>
         <w:rPr>
-          <w:b/>
-          <w:bCs/>
+          <w:b w:val="1"/>
+          <w:bCs w:val="1"/>
           <w:sz w:val="46"/>
           <w:szCs w:val="46"/>
         </w:rPr>
-        <w:t>, what</w:t>
-      </w:r>
-      <w:r>
-        <w:rPr>
-          <w:b/>
-          <w:bCs/>
-          <w:sz w:val="46"/>
-          <w:szCs w:val="46"/>
-        </w:rPr>
-        <w:t xml:space="preserve"> is an AI </w:t>
-      </w:r>
-      <w:r>
-        <w:rPr>
-          <w:b/>
-          <w:bCs/>
-          <w:sz w:val="46"/>
-          <w:szCs w:val="46"/>
-        </w:rPr>
-        <w:t>Agent, what</w:t>
-      </w:r>
-      <w:r>
-        <w:rPr>
-          <w:b/>
-          <w:bCs/>
-          <w:sz w:val="46"/>
-          <w:szCs w:val="46"/>
-        </w:rPr>
-        <w:t xml:space="preserve"> is a Multimodal Agent?</w:t>
+        <w:t>, what is an AI Agent, what is a Multimodal Agent?</w:t>
       </w:r>
     </w:p>
     <w:p>
@@ -1491,7 +1462,7 @@
         <w:rPr>
           <w:lang w:val="en-US"/>
         </w:rPr>
-        <w:t xml:space="preserve"> just say “my watch is broken” — they upload a photo. A support person </w:t>
+        <w:t xml:space="preserve"> just say “my watch is broken”, they upload a photo. A support person </w:t>
       </w:r>
       <w:r>
         <w:rPr>
@@ -1503,7 +1474,7 @@
         <w:rPr>
           <w:lang w:val="en-US"/>
         </w:rPr>
-        <w:t xml:space="preserve"> just read text — they look at the product image, the serial number, the warranty table, and the website form.</w:t>
+        <w:t xml:space="preserve"> just read text, they look at the product image, the serial number, the warranty table, and the website form.</w:t>
       </w:r>
     </w:p>
     <w:p>
@@ -1612,19 +1583,22 @@
           <w:numId w:val="13"/>
         </w:numPr>
         <w:spacing w:after="240"/>
-      </w:pPr>
-      <w:r>
+        <w:rPr/>
+      </w:pPr>
+      <w:r>
+        <w:rPr/>
         <w:t xml:space="preserve">Multimodal agent: </w:t>
       </w:r>
       <w:r>
         <w:rPr>
-          <w:b/>
-          <w:bCs/>
+          <w:b w:val="1"/>
+          <w:bCs w:val="1"/>
         </w:rPr>
         <w:t>Sees</w:t>
       </w:r>
       <w:r>
-        <w:t xml:space="preserve"> the crack in your photo, reads the serial number, finds the exact model policy page, checks the damage type, and tells you “Yes, this is a manufacturing defect — I’ve started the claim for you and attached an annotated version of your photo as proof.”</w:t>
+        <w:rPr/>
+        <w:t xml:space="preserve"> the crack in your photo, reads the serial number, finds the exact model policy page, checks the damage type, and tells you “Yes, this is a manufacturing defect,w I’ve started the claim for you and attached an annotated version of your photo as proof.”</w:t>
       </w:r>
     </w:p>
     <w:p>
@@ -2290,9 +2264,25 @@
           <w:numId w:val="18"/>
         </w:numPr>
         <w:spacing w:before="240" w:after="240"/>
-      </w:pPr>
-      <w:r>
-        <w:t>One model has to be expert at everything, so it can get overwhelmed with very complex tasks.</w:t>
+        <w:rPr/>
+      </w:pPr>
+      <w:r>
+        <w:rPr>
+          <w:lang w:val="en-US"/>
+        </w:rPr>
+        <w:t xml:space="preserve">One model has to be </w:t>
+      </w:r>
+      <w:r>
+        <w:rPr>
+          <w:lang w:val="en-US"/>
+        </w:rPr>
+        <w:t>expert</w:t>
+      </w:r>
+      <w:r>
+        <w:rPr>
+          <w:lang w:val="en-US"/>
+        </w:rPr>
+        <w:t xml:space="preserve"> at everything, so it can get overwhelmed with very complex tasks.</w:t>
       </w:r>
     </w:p>
     <w:p>
@@ -2347,16 +2337,121 @@
           <w:ilvl w:val="0"/>
           <w:numId w:val="7"/>
         </w:numPr>
+        <w:rPr/>
+      </w:pPr>
+      <w:r>
+        <w:rPr>
+          <w:b w:val="1"/>
+          <w:bCs w:val="1"/>
+          <w:lang w:val="en-US"/>
+        </w:rPr>
+        <w:t>Perception Agent</w:t>
+      </w:r>
+      <w:r>
+        <w:rPr>
+          <w:lang w:val="en-US"/>
+        </w:rPr>
+        <w:t xml:space="preserve">: </w:t>
+      </w:r>
+      <w:r>
+        <w:rPr>
+          <w:lang w:val="en-US"/>
+        </w:rPr>
+        <w:t>Expert at</w:t>
+      </w:r>
+      <w:r>
+        <w:rPr>
+          <w:lang w:val="en-US"/>
+        </w:rPr>
+        <w:t xml:space="preserve"> understanding photos, screenshots, and videos.</w:t>
+      </w:r>
+    </w:p>
+    <w:p>
+      <w:pPr>
+        <w:numPr>
+          <w:ilvl w:val="0"/>
+          <w:numId w:val="7"/>
+        </w:numPr>
+        <w:rPr/>
+      </w:pPr>
+      <w:r>
+        <w:rPr>
+          <w:b w:val="1"/>
+          <w:bCs w:val="1"/>
+          <w:lang w:val="en-US"/>
+        </w:rPr>
+        <w:t>Document Agent</w:t>
+      </w:r>
+      <w:r>
+        <w:rPr>
+          <w:lang w:val="en-US"/>
+        </w:rPr>
+        <w:t xml:space="preserve">: </w:t>
+      </w:r>
+      <w:r>
+        <w:rPr>
+          <w:lang w:val="en-US"/>
+        </w:rPr>
+        <w:t>Expert at</w:t>
+      </w:r>
+      <w:r>
+        <w:rPr>
+          <w:lang w:val="en-US"/>
+        </w:rPr>
+        <w:t xml:space="preserve"> reading PDFs, tables, and manuals.</w:t>
+      </w:r>
+    </w:p>
+    <w:p>
+      <w:pPr>
+        <w:numPr>
+          <w:ilvl w:val="0"/>
+          <w:numId w:val="7"/>
+        </w:numPr>
+        <w:rPr/>
+      </w:pPr>
+      <w:r>
+        <w:rPr>
+          <w:b w:val="1"/>
+          <w:bCs w:val="1"/>
+          <w:lang w:val="en-US"/>
+        </w:rPr>
+        <w:t>UI Agent</w:t>
+      </w:r>
+      <w:r>
+        <w:rPr>
+          <w:lang w:val="en-US"/>
+        </w:rPr>
+        <w:t xml:space="preserve">: </w:t>
+      </w:r>
+      <w:r>
+        <w:rPr>
+          <w:lang w:val="en-US"/>
+        </w:rPr>
+        <w:t>Expert at</w:t>
+      </w:r>
+      <w:r>
+        <w:rPr>
+          <w:lang w:val="en-US"/>
+        </w:rPr>
+        <w:t xml:space="preserve"> navigating websites and clicking buttons.</w:t>
+      </w:r>
+    </w:p>
+    <w:p>
+      <w:pPr>
+        <w:numPr>
+          <w:ilvl w:val="0"/>
+          <w:numId w:val="7"/>
+        </w:numPr>
       </w:pPr>
       <w:r>
         <w:rPr>
           <w:b/>
           <w:bCs/>
         </w:rPr>
-        <w:t>Perception Agent</w:t>
-      </w:r>
-      <w:r>
-        <w:t>: Expert at understanding photos, screenshots, and videos.</w:t>
+        <w:t>Verification Agent</w:t>
+      </w:r>
+      <w:r>
+        <w:t>: Expert at catching mistakes and ensuring accuracy.</w:t>
       </w:r>
     </w:p>
     <w:p>
@@ -2365,86 +2460,106 @@
           <w:ilvl w:val="0"/>
           <w:numId w:val="7"/>
         </w:numPr>
+        <w:spacing w:after="240"/>
       </w:pPr>
       <w:r>
         <w:rPr>
           <w:b/>
           <w:bCs/>
         </w:rPr>
-        <w:t>Document Agent</w:t>
-      </w:r>
-      <w:r>
-        <w:t>: Expert at reading PDFs, tables, and manuals.</w:t>
-      </w:r>
-    </w:p>
-    <w:p>
-      <w:pPr>
-        <w:numPr>
-          <w:ilvl w:val="0"/>
-          <w:numId w:val="7"/>
-        </w:numPr>
-      </w:pPr>
+        <w:t>Coordinator (Orchestrator) Agent</w:t>
+      </w:r>
+      <w:r>
+        <w:t>: The leader that assigns tasks and combines the results.</w:t>
+      </w:r>
+    </w:p>
+    <w:p>
+      <w:pPr>
+        <w:pStyle w:val="Heading4"/>
+      </w:pPr>
+      <w:bookmarkStart w:name="_yzx9nr39on3z" w:colFirst="0" w:colLast="0" w:id="23"/>
+      <w:bookmarkEnd w:id="23"/>
       <w:r>
         <w:rPr>
           <w:b/>
           <w:bCs/>
         </w:rPr>
-        <w:t>UI Agent</w:t>
-      </w:r>
-      <w:r>
-        <w:t>: Expert at navigating websites and clicking buttons.</w:t>
-      </w:r>
-    </w:p>
-    <w:p>
-      <w:pPr>
-        <w:numPr>
-          <w:ilvl w:val="0"/>
-          <w:numId w:val="7"/>
-        </w:numPr>
-      </w:pPr>
+        <w:lastRenderedPageBreak/>
+        <w:t>How they work together</w:t>
+      </w:r>
+      <w:r>
+        <w:t>:</w:t>
+      </w:r>
+    </w:p>
+    <w:p>
+      <w:pPr>
+        <w:spacing w:before="240" w:after="240"/>
+      </w:pPr>
+      <w:r>
+        <w:t>The coordinator says: “Perception Agent, analyze the photo. Document Agent, find the policy. UI Agent, prepare the claim form.”</w:t>
+      </w:r>
+      <w:r>
+        <w:t xml:space="preserve"> </w:t>
+      </w:r>
+      <w:r>
+        <w:t>Each specialist does its part and reports back. The team works together until the problem is solved.</w:t>
+      </w:r>
+    </w:p>
+    <w:p>
+      <w:pPr>
+        <w:pStyle w:val="Heading5"/>
+        <w:spacing w:after="240"/>
+      </w:pPr>
+      <w:bookmarkStart w:name="_7fke37kbctsr" w:colFirst="0" w:colLast="0" w:id="24"/>
+      <w:bookmarkEnd w:id="24"/>
       <w:r>
         <w:rPr>
           <w:b/>
           <w:bCs/>
         </w:rPr>
-        <w:t>Verification Agent</w:t>
-      </w:r>
-      <w:r>
-        <w:t>: Expert at catching mistakes and ensuring accuracy.</w:t>
-      </w:r>
-    </w:p>
-    <w:p>
-      <w:pPr>
-        <w:numPr>
-          <w:ilvl w:val="0"/>
-          <w:numId w:val="7"/>
+        <w:t>Advantages</w:t>
+      </w:r>
+      <w:r>
+        <w:t>:</w:t>
+      </w:r>
+    </w:p>
+    <w:p>
+      <w:pPr>
+        <w:numPr>
+          <w:ilvl w:val="0"/>
+          <w:numId w:val="19"/>
+        </w:numPr>
+        <w:spacing w:before="240"/>
+      </w:pPr>
+      <w:r>
+        <w:t>Each agent becomes extremely good at its specialty.</w:t>
+      </w:r>
+    </w:p>
+    <w:p>
+      <w:pPr>
+        <w:numPr>
+          <w:ilvl w:val="0"/>
+          <w:numId w:val="19"/>
         </w:numPr>
         <w:spacing w:after="240"/>
       </w:pPr>
+      <w:r>
+        <w:t>Better for complex, long tasks.</w:t>
+      </w:r>
+    </w:p>
+    <w:p>
+      <w:pPr>
+        <w:pStyle w:val="Heading5"/>
+        <w:spacing w:after="240"/>
+      </w:pPr>
+      <w:bookmarkStart w:name="_7qkonk3kc6qk" w:colFirst="0" w:colLast="0" w:id="25"/>
+      <w:bookmarkEnd w:id="25"/>
       <w:r>
         <w:rPr>
           <w:b/>
           <w:bCs/>
         </w:rPr>
-        <w:t>Coordinator (Orchestrator) Agent</w:t>
-      </w:r>
-      <w:r>
-        <w:t>: The leader that assigns tasks and combines the results.</w:t>
-      </w:r>
-    </w:p>
-    <w:p>
-      <w:pPr>
-        <w:pStyle w:val="Heading4"/>
-      </w:pPr>
-      <w:bookmarkStart w:name="_yzx9nr39on3z" w:colFirst="0" w:colLast="0" w:id="23"/>
-      <w:bookmarkEnd w:id="23"/>
-      <w:r>
-        <w:rPr>
-          <w:b/>
-          <w:bCs/>
-        </w:rPr>
-        <w:lastRenderedPageBreak/>
-        <w:t>How they work together</w:t>
+        <w:t>Disadvantages</w:t>
       </w:r>
       <w:r>
         <w:t>:</w:t>
@@ -2452,88 +2567,42 @@
     </w:p>
     <w:p>
       <w:pPr>
+        <w:numPr>
+          <w:ilvl w:val="0"/>
+          <w:numId w:val="22"/>
+        </w:numPr>
         <w:spacing w:before="240" w:after="240"/>
-      </w:pPr>
-      <w:r>
-        <w:t>The coordinator says: “Perception Agent, analyze the photo. Document Agent, find the policy. UI Agent, prepare the claim form.”</w:t>
-      </w:r>
-      <w:r>
-        <w:t xml:space="preserve"> </w:t>
-      </w:r>
-      <w:r>
-        <w:t>Each specialist does its part and reports back. The team works together until the problem is solved.</w:t>
-      </w:r>
-    </w:p>
-    <w:p>
-      <w:pPr>
-        <w:pStyle w:val="Heading5"/>
-        <w:spacing w:after="240"/>
-      </w:pPr>
-      <w:bookmarkStart w:name="_7fke37kbctsr" w:colFirst="0" w:colLast="0" w:id="24"/>
-      <w:bookmarkEnd w:id="24"/>
-      <w:r>
-        <w:rPr>
-          <w:b/>
-          <w:bCs/>
-        </w:rPr>
-        <w:t>Advantages</w:t>
-      </w:r>
-      <w:r>
-        <w:t>:</w:t>
-      </w:r>
-    </w:p>
-    <w:p>
-      <w:pPr>
-        <w:numPr>
-          <w:ilvl w:val="0"/>
-          <w:numId w:val="19"/>
-        </w:numPr>
-        <w:spacing w:before="240"/>
-      </w:pPr>
-      <w:r>
-        <w:t>Each agent becomes extremely good at its specialty.</w:t>
-      </w:r>
-    </w:p>
-    <w:p>
-      <w:pPr>
-        <w:numPr>
-          <w:ilvl w:val="0"/>
-          <w:numId w:val="19"/>
-        </w:numPr>
-        <w:spacing w:after="240"/>
-      </w:pPr>
-      <w:r>
-        <w:t>Better for complex, long tasks.</w:t>
-      </w:r>
-    </w:p>
-    <w:p>
-      <w:pPr>
-        <w:pStyle w:val="Heading5"/>
-        <w:spacing w:after="240"/>
-      </w:pPr>
-      <w:bookmarkStart w:name="_7qkonk3kc6qk" w:colFirst="0" w:colLast="0" w:id="25"/>
-      <w:bookmarkEnd w:id="25"/>
-      <w:r>
-        <w:rPr>
-          <w:b/>
-          <w:bCs/>
-        </w:rPr>
-        <w:t>Disadvantages</w:t>
-      </w:r>
-      <w:r>
-        <w:t>:</w:t>
-      </w:r>
-    </w:p>
-    <w:p>
-      <w:pPr>
-        <w:numPr>
-          <w:ilvl w:val="0"/>
-          <w:numId w:val="22"/>
-        </w:numPr>
-        <w:spacing w:before="240" w:after="240"/>
-      </w:pPr>
-      <w:r>
-        <w:t>More complex to build and coordinate.</w:t>
+        <w:rPr/>
+      </w:pPr>
+      <w:r>
+        <w:rPr>
+          <w:lang w:val="en-US"/>
+        </w:rPr>
+        <w:t xml:space="preserve">More complex </w:t>
+      </w:r>
+      <w:r>
+        <w:rPr>
+          <w:lang w:val="en-US"/>
+        </w:rPr>
+        <w:t>to build</w:t>
+      </w:r>
+      <w:r>
+        <w:rPr>
+          <w:lang w:val="en-US"/>
+        </w:rPr>
+        <w:t xml:space="preserve"> and </w:t>
+      </w:r>
+      <w:r>
+        <w:rPr>
+          <w:lang w:val="en-US"/>
+        </w:rPr>
+        <w:t>coordinate</w:t>
+      </w:r>
+      <w:r>
+        <w:rPr>
+          <w:lang w:val="en-US"/>
+        </w:rPr>
+        <w:t>.</w:t>
       </w:r>
     </w:p>
     <w:p>
@@ -2626,16 +2695,63 @@
           <w:numId w:val="17"/>
         </w:numPr>
         <w:spacing w:before="240"/>
+        <w:rPr/>
+      </w:pPr>
+      <w:r>
+        <w:rPr>
+          <w:b w:val="1"/>
+          <w:bCs w:val="1"/>
+          <w:lang w:val="en-US"/>
+        </w:rPr>
+        <w:t>Reactive Planning</w:t>
+      </w:r>
+      <w:r>
+        <w:rPr>
+          <w:lang w:val="en-US"/>
+        </w:rPr>
+        <w:t xml:space="preserve"> (also called </w:t>
+      </w:r>
+      <w:r>
+        <w:rPr>
+          <w:lang w:val="en-US"/>
+        </w:rPr>
+        <w:t>ReAct</w:t>
+      </w:r>
+      <w:r>
+        <w:rPr>
+          <w:lang w:val="en-US"/>
+        </w:rPr>
+        <w:t xml:space="preserve">) The agent does one small step, sees the result, then </w:t>
+      </w:r>
+      <w:r>
+        <w:rPr>
+          <w:lang w:val="en-US"/>
+        </w:rPr>
+        <w:t>immediately</w:t>
+      </w:r>
+      <w:r>
+        <w:rPr>
+          <w:lang w:val="en-US"/>
+        </w:rPr>
+        <w:t xml:space="preserve"> decides the next step. Very flexible and good for dynamic situations.</w:t>
+      </w:r>
+    </w:p>
+    <w:p>
+      <w:pPr>
+        <w:numPr>
+          <w:ilvl w:val="0"/>
+          <w:numId w:val="17"/>
+        </w:numPr>
       </w:pPr>
       <w:r>
         <w:rPr>
           <w:b/>
           <w:bCs/>
         </w:rPr>
-        <w:t>Reactive Planning</w:t>
-      </w:r>
-      <w:r>
-        <w:t xml:space="preserve"> (also called ReAct) The agent does one small step, sees the result, then immediately decides the next step. Very flexible and good for dynamic situations.</w:t>
+        <w:t>Planner-Executor Style</w:t>
+      </w:r>
+      <w:r>
+        <w:t xml:space="preserve"> First creates a complete step-by-step plan, then follows it. More organized and better for longer tasks.</w:t>
       </w:r>
     </w:p>
     <w:p>
@@ -2644,40 +2760,39 @@
           <w:ilvl w:val="0"/>
           <w:numId w:val="17"/>
         </w:numPr>
-      </w:pPr>
-      <w:r>
-        <w:rPr>
-          <w:b/>
-          <w:bCs/>
-        </w:rPr>
-        <w:t>Planner-Executor Style</w:t>
-      </w:r>
-      <w:r>
-        <w:t xml:space="preserve"> First creates a complete step-by-step plan, then follows it. More organized and better for longer tasks.</w:t>
-      </w:r>
-    </w:p>
-    <w:p>
-      <w:pPr>
-        <w:numPr>
-          <w:ilvl w:val="0"/>
-          <w:numId w:val="17"/>
-        </w:numPr>
         <w:spacing w:after="240"/>
-      </w:pPr>
-      <w:r>
-        <w:rPr>
-          <w:b/>
-          <w:bCs/>
+        <w:rPr/>
+      </w:pPr>
+      <w:r>
+        <w:rPr>
+          <w:b w:val="1"/>
+          <w:bCs w:val="1"/>
+          <w:lang w:val="en-US"/>
         </w:rPr>
         <w:t>Hierarchical Planning</w:t>
       </w:r>
       <w:r>
-        <w:t xml:space="preserve"> Has different levels</w:t>
-      </w:r>
-      <w:r>
+        <w:rPr>
+          <w:lang w:val="en-US"/>
+        </w:rPr>
+        <w:t xml:space="preserve"> Has different </w:t>
+      </w:r>
+      <w:r>
+        <w:rPr>
+          <w:lang w:val="en-US"/>
+        </w:rPr>
+        <w:t>levels</w:t>
+      </w:r>
+      <w:r>
+        <w:rPr>
+          <w:lang w:val="en-US"/>
+        </w:rPr>
         <w:t>,</w:t>
       </w:r>
       <w:r>
+        <w:rPr>
+          <w:lang w:val="en-US"/>
+        </w:rPr>
         <w:t xml:space="preserve"> a senior agent makes the big-picture plan, then delegates detailed work to junior agents. Most powerful for complex real-world work.</w:t>
       </w:r>
     </w:p>
@@ -2773,12 +2888,28 @@
           <w:numId w:val="10"/>
         </w:numPr>
         <w:spacing w:after="240"/>
+        <w:rPr/>
       </w:pPr>
       <w:r>
         <w:rPr>
           <w:rFonts w:ascii="Arial Unicode MS" w:hAnsi="Arial Unicode MS" w:eastAsia="Arial Unicode MS" w:cs="Arial Unicode MS"/>
-        </w:rPr>
-        <w:t>Send a screenshot of the warranty website → tool clicks the correct button automatically.</w:t>
+          <w:lang w:val="en-US"/>
+        </w:rPr>
+        <w:t xml:space="preserve">Send a screenshot of the warranty website → tool </w:t>
+      </w:r>
+      <w:r>
+        <w:rPr>
+          <w:rFonts w:ascii="Arial Unicode MS" w:hAnsi="Arial Unicode MS" w:eastAsia="Arial Unicode MS" w:cs="Arial Unicode MS"/>
+          <w:lang w:val="en-US"/>
+        </w:rPr>
+        <w:t>clicks</w:t>
+      </w:r>
+      <w:r>
+        <w:rPr>
+          <w:rFonts w:ascii="Arial Unicode MS" w:hAnsi="Arial Unicode MS" w:eastAsia="Arial Unicode MS" w:cs="Arial Unicode MS"/>
+          <w:lang w:val="en-US"/>
+        </w:rPr>
+        <w:t xml:space="preserve"> the correct button automatically.</w:t>
       </w:r>
     </w:p>
     <w:p>
@@ -2882,12 +3013,27 @@
         <w:spacing w:after="240"/>
       </w:pPr>
       <w:r>
-        <w:t>One powerful agent receives your cracked watch photo. It analyzes the photo, finds the policy, checks eligibility, opens the claim form, fills it, and sends you the confirmation</w:t>
-      </w:r>
-      <w:r>
+        <w:rPr>
+          <w:lang w:val="en-US"/>
+        </w:rPr>
+        <w:t xml:space="preserve">One powerful agent receives your cracked watch photo. It analyzes the photo, finds the policy, checks eligibility, opens the claim form, fills it, and sends you </w:t>
+      </w:r>
+      <w:r>
+        <w:rPr>
+          <w:lang w:val="en-US"/>
+        </w:rPr>
+        <w:t>the confirmation</w:t>
+      </w:r>
+      <w:r>
+        <w:rPr>
+          <w:lang w:val="en-US"/>
+        </w:rPr>
         <w:t>,</w:t>
       </w:r>
       <w:r>
+        <w:rPr>
+          <w:lang w:val="en-US"/>
+        </w:rPr>
         <w:t xml:space="preserve"> all by itself.</w:t>
       </w:r>
     </w:p>
@@ -2909,9 +3055,25 @@
           <w:numId w:val="15"/>
         </w:numPr>
         <w:spacing w:before="240"/>
-      </w:pPr>
-      <w:r>
-        <w:t>Perception Agent analyzes the photo and extracts serial number.</w:t>
+        <w:rPr/>
+      </w:pPr>
+      <w:r>
+        <w:rPr>
+          <w:lang w:val="en-US"/>
+        </w:rPr>
+        <w:t xml:space="preserve">Perception Agent analyzes the photo and extracts </w:t>
+      </w:r>
+      <w:r>
+        <w:rPr>
+          <w:lang w:val="en-US"/>
+        </w:rPr>
+        <w:t>serial</w:t>
+      </w:r>
+      <w:r>
+        <w:rPr>
+          <w:lang w:val="en-US"/>
+        </w:rPr>
+        <w:t xml:space="preserve"> number.</w:t>
       </w:r>
     </w:p>
     <w:p>
@@ -3063,52 +3225,63 @@
           <w:ilvl w:val="0"/>
           <w:numId w:val="11"/>
         </w:numPr>
+        <w:rPr/>
+      </w:pPr>
+      <w:r>
+        <w:rPr>
+          <w:b w:val="1"/>
+          <w:bCs w:val="1"/>
+          <w:lang w:val="en-US"/>
+        </w:rPr>
+        <w:t xml:space="preserve">Single vs </w:t>
+      </w:r>
+      <w:r>
+        <w:rPr>
+          <w:b w:val="1"/>
+          <w:bCs w:val="1"/>
+          <w:lang w:val="en-US"/>
+        </w:rPr>
+        <w:t>Multi-Agent</w:t>
+      </w:r>
+      <w:r>
+        <w:rPr>
+          <w:rFonts w:ascii="Arial Unicode MS" w:hAnsi="Arial Unicode MS" w:eastAsia="Arial Unicode MS" w:cs="Arial Unicode MS"/>
+          <w:lang w:val="en-US"/>
+        </w:rPr>
+        <w:t xml:space="preserve"> → single for speed/simplicity, multi for complex teamwork</w:t>
+      </w:r>
+    </w:p>
+    <w:p>
+      <w:pPr>
+        <w:numPr>
+          <w:ilvl w:val="0"/>
+          <w:numId w:val="11"/>
+        </w:numPr>
+        <w:spacing w:after="240"/>
       </w:pPr>
       <w:r>
         <w:rPr>
           <w:b/>
           <w:bCs/>
         </w:rPr>
-        <w:t>Single vs Multi-Agent</w:t>
+        <w:t>Visual Tool Use</w:t>
       </w:r>
       <w:r>
         <w:rPr>
           <w:rFonts w:ascii="Arial Unicode MS" w:hAnsi="Arial Unicode MS" w:eastAsia="Arial Unicode MS" w:cs="Arial Unicode MS"/>
         </w:rPr>
-        <w:t xml:space="preserve"> → single for speed/simplicity, multi for complex teamwork</w:t>
-      </w:r>
-    </w:p>
-    <w:p>
-      <w:pPr>
-        <w:numPr>
-          <w:ilvl w:val="0"/>
-          <w:numId w:val="11"/>
-        </w:numPr>
-        <w:spacing w:after="240"/>
-      </w:pPr>
-      <w:r>
-        <w:rPr>
-          <w:b/>
-          <w:bCs/>
-        </w:rPr>
-        <w:t>Visual Tool Use</w:t>
+        <w:t xml:space="preserve"> → the real revolution</w:t>
       </w:r>
       <w:r>
         <w:rPr>
           <w:rFonts w:ascii="Arial Unicode MS" w:hAnsi="Arial Unicode MS" w:eastAsia="Arial Unicode MS" w:cs="Arial Unicode MS"/>
         </w:rPr>
-        <w:t xml:space="preserve"> → the real revolution</w:t>
+        <w:t xml:space="preserve">, </w:t>
       </w:r>
       <w:r>
         <w:rPr>
           <w:rFonts w:ascii="Arial Unicode MS" w:hAnsi="Arial Unicode MS" w:eastAsia="Arial Unicode MS" w:cs="Arial Unicode MS"/>
         </w:rPr>
-        <w:t xml:space="preserve">, </w:t>
-      </w:r>
-      <w:r>
-        <w:rPr>
-          <w:rFonts w:ascii="Arial Unicode MS" w:hAnsi="Arial Unicode MS" w:eastAsia="Arial Unicode MS" w:cs="Arial Unicode MS"/>
-        </w:rPr>
         <w:t>agents can now “see” and act on photos, screenshots, documents</w:t>
       </w:r>
     </w:p>
@@ -3117,45 +3290,121 @@
         <w:spacing w:before="240" w:after="240"/>
       </w:pPr>
       <w:r>
-        <w:t>In 2026, the biggest value in e-commerce and support isn’t just answering questions</w:t>
-      </w:r>
-      <w:r>
+        <w:rPr>
+          <w:lang w:val="en-US"/>
+        </w:rPr>
+        <w:t xml:space="preserve">In 2026, the biggest value in e-commerce and support </w:t>
+      </w:r>
+      <w:r>
+        <w:rPr>
+          <w:lang w:val="en-US"/>
+        </w:rPr>
+        <w:t>isn’t</w:t>
+      </w:r>
+      <w:r>
+        <w:rPr>
+          <w:lang w:val="en-US"/>
+        </w:rPr>
+        <w:t xml:space="preserve"> just answering </w:t>
+      </w:r>
+      <w:r>
+        <w:rPr>
+          <w:lang w:val="en-US"/>
+        </w:rPr>
+        <w:t>questions</w:t>
+      </w:r>
+      <w:r>
+        <w:rPr>
+          <w:lang w:val="en-US"/>
+        </w:rPr>
         <w:t>,</w:t>
       </w:r>
       <w:r>
-        <w:t xml:space="preserve"> it’s </w:t>
-      </w:r>
-      <w:r>
-        <w:rPr>
-          <w:b/>
-          <w:bCs/>
+        <w:rPr>
+          <w:lang w:val="en-US"/>
+        </w:rPr>
+        <w:t xml:space="preserve"> </w:t>
+      </w:r>
+      <w:r>
+        <w:rPr>
+          <w:lang w:val="en-US"/>
+        </w:rPr>
+        <w:t>it’s</w:t>
+      </w:r>
+      <w:r>
+        <w:rPr>
+          <w:lang w:val="en-US"/>
+        </w:rPr>
+        <w:t xml:space="preserve"> </w:t>
+      </w:r>
+      <w:r>
+        <w:rPr>
+          <w:b w:val="1"/>
+          <w:bCs w:val="1"/>
+          <w:lang w:val="en-US"/>
         </w:rPr>
         <w:t>acting on what the customer shows you</w:t>
       </w:r>
       <w:r>
-        <w:t>. A multimodal agent doesn’t just tell you about warranty</w:t>
-      </w:r>
-      <w:r>
+        <w:rPr>
+          <w:lang w:val="en-US"/>
+        </w:rPr>
+        <w:t xml:space="preserve">. A multimodal agent </w:t>
+      </w:r>
+      <w:r>
+        <w:rPr>
+          <w:lang w:val="en-US"/>
+        </w:rPr>
+        <w:t>doesn’t</w:t>
+      </w:r>
+      <w:r>
+        <w:rPr>
+          <w:lang w:val="en-US"/>
+        </w:rPr>
+        <w:t xml:space="preserve"> just tell you about </w:t>
+      </w:r>
+      <w:r>
+        <w:rPr>
+          <w:lang w:val="en-US"/>
+        </w:rPr>
+        <w:t>warranty</w:t>
+      </w:r>
+      <w:r>
+        <w:rPr>
+          <w:lang w:val="en-US"/>
+        </w:rPr>
         <w:t>,</w:t>
       </w:r>
       <w:r>
+        <w:rPr>
+          <w:lang w:val="en-US"/>
+        </w:rPr>
         <w:t xml:space="preserve"> it sees your cracked watch, reads the policy, fills the form, and starts the claim.</w:t>
       </w:r>
     </w:p>
     <w:p>
       <w:pPr>
         <w:pBdr>
-          <w:top w:val="single" w:color="auto" w:sz="4" w:space="1"/>
-          <w:left w:val="single" w:color="auto" w:sz="4" w:space="4"/>
-          <w:bottom w:val="single" w:color="auto" w:sz="4" w:space="1"/>
-          <w:right w:val="single" w:color="auto" w:sz="4" w:space="4"/>
-          <w:between w:val="single" w:color="auto" w:sz="4" w:space="1"/>
-          <w:bar w:val="single" w:color="auto" w:sz="4"/>
+          <w:top w:val="single" w:color="FF000000" w:sz="4" w:space="1"/>
+          <w:left w:val="single" w:color="FF000000" w:sz="4" w:space="4"/>
+          <w:bottom w:val="single" w:color="FF000000" w:sz="4" w:space="1"/>
+          <w:right w:val="single" w:color="FF000000" w:sz="4" w:space="4"/>
+          <w:between w:val="single" w:color="FF000000" w:sz="4" w:space="1"/>
+          <w:bar w:val="single" w:color="FF000000" w:sz="4" w:space="0"/>
         </w:pBdr>
         <w:spacing w:before="240" w:after="240"/>
       </w:pPr>
       <w:r>
-        <w:t>That’s the leap from “helpful chatbot” to “autonomous digital employee.”</w:t>
+        <w:rPr>
+          <w:lang w:val="en-US"/>
+        </w:rPr>
+        <w:t>That’s</w:t>
+      </w:r>
+      <w:r>
+        <w:rPr>
+          <w:lang w:val="en-US"/>
+        </w:rPr>
+        <w:t xml:space="preserve"> the leap from “helpful chatbot” to “autonomous digital employee.”</w:t>
       </w:r>
     </w:p>
     <w:p>
@@ -3163,12 +3412,33 @@
         <w:spacing w:before="240" w:after="240"/>
       </w:pPr>
       <w:r>
-        <w:t>And that’s exactly what turns customer frustration into delight</w:t>
-      </w:r>
-      <w:r>
+        <w:rPr>
+          <w:lang w:val="en-US"/>
+        </w:rPr>
+        <w:t xml:space="preserve">And </w:t>
+      </w:r>
+      <w:r>
+        <w:rPr>
+          <w:lang w:val="en-US"/>
+        </w:rPr>
+        <w:t>that’s</w:t>
+      </w:r>
+      <w:r>
+        <w:rPr>
+          <w:lang w:val="en-US"/>
+        </w:rPr>
+        <w:t xml:space="preserve"> exactly what turns customer frustration into delight</w:t>
+      </w:r>
+      <w:r>
+        <w:rPr>
+          <w:lang w:val="en-US"/>
+        </w:rPr>
         <w:t>,</w:t>
       </w:r>
       <w:r>
+        <w:rPr>
+          <w:lang w:val="en-US"/>
+        </w:rPr>
         <w:t xml:space="preserve"> and support tickets into solved cases.</w:t>
       </w:r>
     </w:p>

</xml_diff>